<commit_message>
Add BMC Bioinformatics submission package; fix README citation; archive graph artifacts via release v1.0.0
</commit_message>
<xml_diff>
--- a/submission/cover_letter.docx
+++ b/submission/cover_letter.docx
@@ -365,6 +365,88 @@
           <w:bCs/>
         </w:rPr>
         <w:t xml:space="preserve">Yongxin Yang</w:t>
+      </w:r>
+    </w:p>
+    <w:p>
+      <w:r>
+        <w:rPr>
+          <w:rFonts w:ascii="Times New Roman" w:hAnsi="Times New Roman"/>
+        </w:rPr>
+        <w:t xml:space="preserve"/>
+      </w:r>
+    </w:p>
+    <w:p>
+      <w:r>
+        <w:rPr>
+          <w:b/>
+          <w:rFonts w:ascii="Times New Roman" w:hAnsi="Times New Roman"/>
+        </w:rPr>
+        <w:t xml:space="preserve">Suggested Reviewers</w:t>
+      </w:r>
+    </w:p>
+    <w:p>
+      <w:r>
+        <w:rPr>
+          <w:rFonts w:ascii="Times New Roman" w:hAnsi="Times New Roman"/>
+        </w:rPr>
+        <w:t xml:space="preserve"/>
+      </w:r>
+    </w:p>
+    <w:p>
+      <w:r>
+        <w:rPr>
+          <w:rFonts w:ascii="Times New Roman" w:hAnsi="Times New Roman"/>
+        </w:rPr>
+        <w:t xml:space="preserve">1. Knowledge graph / biomedical database expert with expertise in semantic network construction, biomedical ontology development, or database resource curation.</w:t>
+      </w:r>
+    </w:p>
+    <w:p>
+      <w:r>
+        <w:rPr>
+          <w:rFonts w:ascii="Times New Roman" w:hAnsi="Times New Roman"/>
+        </w:rPr>
+        <w:t xml:space="preserve"/>
+      </w:r>
+    </w:p>
+    <w:p>
+      <w:r>
+        <w:rPr>
+          <w:rFonts w:ascii="Times New Roman" w:hAnsi="Times New Roman"/>
+        </w:rPr>
+        <w:t xml:space="preserve">2. Pain biology / neuroscience researcher with expertise in molecular mechanisms of chronic pain, nociceptive signaling pathways, or inflammatory pain.</w:t>
+      </w:r>
+    </w:p>
+    <w:p>
+      <w:r>
+        <w:rPr>
+          <w:rFonts w:ascii="Times New Roman" w:hAnsi="Times New Roman"/>
+        </w:rPr>
+        <w:t xml:space="preserve"/>
+      </w:r>
+    </w:p>
+    <w:p>
+      <w:r>
+        <w:rPr>
+          <w:rFonts w:ascii="Times New Roman" w:hAnsi="Times New Roman"/>
+        </w:rPr>
+        <w:t xml:space="preserve">3. Bioinformatics / computational biology researcher with expertise in network analysis, multi-omics integration, or knowledge graph validation methodologies.</w:t>
+      </w:r>
+    </w:p>
+    <w:p>
+      <w:r>
+        <w:rPr>
+          <w:rFonts w:ascii="Times New Roman" w:hAnsi="Times New Roman"/>
+        </w:rPr>
+        <w:t xml:space="preserve"/>
+      </w:r>
+    </w:p>
+    <w:p>
+      <w:r>
+        <w:rPr>
+          <w:i/>
+          <w:rFonts w:ascii="Times New Roman" w:hAnsi="Times New Roman"/>
+        </w:rPr>
+        <w:t xml:space="preserve">[Note: Please update with specific names, affiliations, and email addresses of suggested reviewers before submission.]</w:t>
       </w:r>
     </w:p>
     <w:p>

</xml_diff>